<commit_message>
Add domestic parenting app comparison and AI trend notes
Co-Authored-By: Claude Sonnet 5.5 <noreply@anthropic.com>
Claude-Session: https://claude.ai/code/session_01YUs4ThZR7vyJGPPKhVC9wX
</commit_message>
<xml_diff>
--- a/research/00_시장_개요.docx
+++ b/research/00_시장_개요.docx
@@ -539,8 +539,544 @@
         <w:t xml:space="preserve">☐ 다른 조사 기관(Statista, Grand View Research 등) 수치와 교차 확인</w:t>
       </w:r>
     </w:p>
+    <w:p>
+      <w:r>
+        <w:pict>
+          <v:rect style="width:0;height:1.5pt" o:hralign="center" o:hrstd="t" o:hr="t"/>
+        </w:pict>
+      </w:r>
+    </w:p>
     <w:bookmarkEnd w:id="24"/>
     <w:bookmarkEnd w:id="25"/>
+    <w:bookmarkStart w:id="30" w:name="추가-자료-국내-육아-앱-및-ai-트렌드-사용자-제공-출처-미확인"/>
+    <w:p>
+      <w:pPr>
+        <w:pStyle w:val="Heading1"/>
+      </w:pPr>
+      <w:r>
+        <w:t xml:space="preserve">추가 자료: 국내 육아 앱 및 AI 트렌드 (사용자 제공, 출처 미확인)</w:t>
+      </w:r>
+    </w:p>
+    <w:p>
+      <w:pPr>
+        <w:pStyle w:val="BlockText"/>
+      </w:pPr>
+      <w:r>
+        <w:t xml:space="preserve">아래 내용은 사용자가 전달한 자료를 정리한 것이며 출처 URL이 없어 수치는</w:t>
+      </w:r>
+      <w:r>
+        <w:t xml:space="preserve"> </w:t>
+      </w:r>
+      <w:r>
+        <w:rPr>
+          <w:bCs/>
+          <w:b/>
+        </w:rPr>
+        <w:t xml:space="preserve">미검증</w:t>
+      </w:r>
+      <w:r>
+        <w:t xml:space="preserve">입니다. 기획서·발표에 쓰기 전에 원출처를 확인하세요.</w:t>
+      </w:r>
+    </w:p>
+    <w:bookmarkStart w:id="26" w:name="국내-주요-육아-앱"/>
+    <w:p>
+      <w:pPr>
+        <w:pStyle w:val="Heading2"/>
+      </w:pPr>
+      <w:r>
+        <w:t xml:space="preserve">1. 국내 주요 육아 앱</w:t>
+      </w:r>
+    </w:p>
+    <w:p>
+      <w:pPr>
+        <w:pStyle w:val="FirstParagraph"/>
+      </w:pPr>
+      <w:r>
+        <w:t xml:space="preserve">국내 시장은 매출 수치보다 MAU와 플랫폼 확장성 중심으로 경쟁한다. 주요 16개 육아 앱의 평균 MAU가 약 24% 상승했다는 내용이 있다. (미검증)</w:t>
+      </w:r>
+    </w:p>
+    <w:tbl>
+      <w:tblPr>
+        <w:tblStyle w:val="Table"/>
+        <w:tblW w:type="pct" w:w="5000"/>
+        <w:tblLook w:firstRow="1" w:lastRow="0" w:firstColumn="0" w:lastColumn="0" w:noHBand="0" w:noVBand="0" w:val="0020"/>
+        <w:jc w:val="start"/>
+      </w:tblPr>
+      <w:tblGrid>
+        <w:gridCol w:w="2640"/>
+        <w:gridCol w:w="2640"/>
+        <w:gridCol w:w="2640"/>
+      </w:tblGrid>
+      <w:tr>
+        <w:trPr>
+          <w:tblHeader w:val="true"/>
+        </w:trPr>
+        <w:tc>
+          <w:tcPr/>
+          <w:p>
+            <w:pPr>
+              <w:pStyle w:val="Compact"/>
+              <w:jc w:val="left"/>
+            </w:pPr>
+            <w:r>
+              <w:t xml:space="preserve">앱</w:t>
+            </w:r>
+          </w:p>
+        </w:tc>
+        <w:tc>
+          <w:tcPr/>
+          <w:p>
+            <w:pPr>
+              <w:pStyle w:val="Compact"/>
+              <w:jc w:val="left"/>
+            </w:pPr>
+            <w:r>
+              <w:t xml:space="preserve">주요 타깃·카테고리</w:t>
+            </w:r>
+          </w:p>
+        </w:tc>
+        <w:tc>
+          <w:tcPr/>
+          <w:p>
+            <w:pPr>
+              <w:pStyle w:val="Compact"/>
+              <w:jc w:val="left"/>
+            </w:pPr>
+            <w:r>
+              <w:t xml:space="preserve">특징 및 수익 구조</w:t>
+            </w:r>
+          </w:p>
+        </w:tc>
+      </w:tr>
+      <w:tr>
+        <w:tc>
+          <w:tcPr/>
+          <w:p>
+            <w:pPr>
+              <w:pStyle w:val="Compact"/>
+              <w:jc w:val="left"/>
+            </w:pPr>
+            <w:r>
+              <w:t xml:space="preserve">베이비타임</w:t>
+            </w:r>
+          </w:p>
+        </w:tc>
+        <w:tc>
+          <w:tcPr/>
+          <w:p>
+            <w:pPr>
+              <w:pStyle w:val="Compact"/>
+              <w:jc w:val="left"/>
+            </w:pPr>
+            <w:r>
+              <w:t xml:space="preserve">신생아 부모(0~12개월)</w:t>
+            </w:r>
+          </w:p>
+        </w:tc>
+        <w:tc>
+          <w:tcPr/>
+          <w:p>
+            <w:pPr>
+              <w:pStyle w:val="Compact"/>
+              <w:jc w:val="left"/>
+            </w:pPr>
+            <w:r>
+              <w:t xml:space="preserve">수유·성장 기록 1위. 위젯, 부모 간 실시간 동기화. 인앱 광고, 육아용품 커머스 연계</w:t>
+            </w:r>
+          </w:p>
+        </w:tc>
+      </w:tr>
+      <w:tr>
+        <w:tc>
+          <w:tcPr/>
+          <w:p>
+            <w:pPr>
+              <w:pStyle w:val="Compact"/>
+              <w:jc w:val="left"/>
+            </w:pPr>
+            <w:r>
+              <w:t xml:space="preserve">똑닥</w:t>
+            </w:r>
+          </w:p>
+        </w:tc>
+        <w:tc>
+          <w:tcPr/>
+          <w:p>
+            <w:pPr>
+              <w:pStyle w:val="Compact"/>
+              <w:jc w:val="left"/>
+            </w:pPr>
+            <w:r>
+              <w:t xml:space="preserve">영유아 부모 전반</w:t>
+            </w:r>
+          </w:p>
+        </w:tc>
+        <w:tc>
+          <w:tcPr/>
+          <w:p>
+            <w:pPr>
+              <w:pStyle w:val="Compact"/>
+              <w:jc w:val="left"/>
+            </w:pPr>
+            <w:r>
+              <w:t xml:space="preserve">병원 예약·접수 플랫폼. 유료 멤버십 구독, 병원 대상 서비스 이용료</w:t>
+            </w:r>
+          </w:p>
+        </w:tc>
+      </w:tr>
+      <w:tr>
+        <w:tc>
+          <w:tcPr/>
+          <w:p>
+            <w:pPr>
+              <w:pStyle w:val="Compact"/>
+              <w:jc w:val="left"/>
+            </w:pPr>
+            <w:r>
+              <w:t xml:space="preserve">열나요</w:t>
+            </w:r>
+          </w:p>
+        </w:tc>
+        <w:tc>
+          <w:tcPr/>
+          <w:p>
+            <w:pPr>
+              <w:pStyle w:val="Compact"/>
+              <w:jc w:val="left"/>
+            </w:pPr>
+            <w:r>
+              <w:t xml:space="preserve">영유아 부모 전반</w:t>
+            </w:r>
+          </w:p>
+        </w:tc>
+        <w:tc>
+          <w:tcPr/>
+          <w:p>
+            <w:pPr>
+              <w:pStyle w:val="Compact"/>
+              <w:jc w:val="left"/>
+            </w:pPr>
+            <w:r>
+              <w:t xml:space="preserve">발열 관리, 해열제 복용 가이드. 의료 데이터 기반, 제약사 광고·제휴</w:t>
+            </w:r>
+          </w:p>
+        </w:tc>
+      </w:tr>
+      <w:tr>
+        <w:tc>
+          <w:tcPr/>
+          <w:p>
+            <w:pPr>
+              <w:pStyle w:val="Compact"/>
+              <w:jc w:val="left"/>
+            </w:pPr>
+            <w:r>
+              <w:t xml:space="preserve">280days</w:t>
+            </w:r>
+          </w:p>
+        </w:tc>
+        <w:tc>
+          <w:tcPr/>
+          <w:p>
+            <w:pPr>
+              <w:pStyle w:val="Compact"/>
+              <w:jc w:val="left"/>
+            </w:pPr>
+            <w:r>
+              <w:t xml:space="preserve">임산부·예비 부모</w:t>
+            </w:r>
+          </w:p>
+        </w:tc>
+        <w:tc>
+          <w:tcPr/>
+          <w:p>
+            <w:pPr>
+              <w:pStyle w:val="Compact"/>
+              <w:jc w:val="left"/>
+            </w:pPr>
+            <w:r>
+              <w:t xml:space="preserve">일러스트 기반 주수별 성장 체크, 부부 연동. 프리미엄 결제, 태아보험 등 제휴</w:t>
+            </w:r>
+          </w:p>
+        </w:tc>
+      </w:tr>
+      <w:tr>
+        <w:tc>
+          <w:tcPr/>
+          <w:p>
+            <w:pPr>
+              <w:pStyle w:val="Compact"/>
+              <w:jc w:val="left"/>
+            </w:pPr>
+            <w:r>
+              <w:t xml:space="preserve">베이비빌리</w:t>
+            </w:r>
+          </w:p>
+        </w:tc>
+        <w:tc>
+          <w:tcPr/>
+          <w:p>
+            <w:pPr>
+              <w:pStyle w:val="Compact"/>
+              <w:jc w:val="left"/>
+            </w:pPr>
+            <w:r>
+              <w:t xml:space="preserve">예비 부모~영유아 부모</w:t>
+            </w:r>
+          </w:p>
+        </w:tc>
+        <w:tc>
+          <w:tcPr/>
+          <w:p>
+            <w:pPr>
+              <w:pStyle w:val="Compact"/>
+              <w:jc w:val="left"/>
+            </w:pPr>
+            <w:r>
+              <w:t xml:space="preserve">임신·육아 콘텐츠 커뮤니티, 맞춤형 커머스(</w:t>
+            </w:r>
+            <w:r>
+              <w:t xml:space="preserve">‘</w:t>
+            </w:r>
+            <w:r>
+              <w:t xml:space="preserve">빌리쇼핑</w:t>
+            </w:r>
+            <w:r>
+              <w:t xml:space="preserve">’</w:t>
+            </w:r>
+            <w:r>
+              <w:t xml:space="preserve">)</w:t>
+            </w:r>
+          </w:p>
+        </w:tc>
+      </w:tr>
+    </w:tbl>
+    <w:bookmarkEnd w:id="26"/>
+    <w:bookmarkStart w:id="27" w:name="ai-기반-육아-서비스-트렌드"/>
+    <w:p>
+      <w:pPr>
+        <w:pStyle w:val="Heading2"/>
+      </w:pPr>
+      <w:r>
+        <w:t xml:space="preserve">2. AI 기반 육아 서비스 트렌드</w:t>
+      </w:r>
+    </w:p>
+    <w:p>
+      <w:pPr>
+        <w:numPr>
+          <w:ilvl w:val="0"/>
+          <w:numId w:val="1005"/>
+        </w:numPr>
+        <w:pStyle w:val="Compact"/>
+      </w:pPr>
+      <w:r>
+        <w:t xml:space="preserve">글로벌 AI 육아·보육 시장 연평균 22.3% 성장 (미검증)</w:t>
+      </w:r>
+    </w:p>
+    <w:p>
+      <w:pPr>
+        <w:numPr>
+          <w:ilvl w:val="0"/>
+          <w:numId w:val="1005"/>
+        </w:numPr>
+        <w:pStyle w:val="Compact"/>
+      </w:pPr>
+      <w:r>
+        <w:t xml:space="preserve">울음소리 AI 분석: 배고픔·졸림·아픔·기저귀 상태를 90% 이상 확률로 판별한다는 주장 (정확도 근거 확인 필요)</w:t>
+      </w:r>
+    </w:p>
+    <w:p>
+      <w:pPr>
+        <w:numPr>
+          <w:ilvl w:val="0"/>
+          <w:numId w:val="1005"/>
+        </w:numPr>
+        <w:pStyle w:val="Compact"/>
+      </w:pPr>
+      <w:r>
+        <w:t xml:space="preserve">챗GPT 연계 육아 상담: 24시간 챗봇이 소아과 가이드라인 기반 조언·이유식 레시피 제안</w:t>
+      </w:r>
+    </w:p>
+    <w:p>
+      <w:pPr>
+        <w:numPr>
+          <w:ilvl w:val="0"/>
+          <w:numId w:val="1005"/>
+        </w:numPr>
+        <w:pStyle w:val="Compact"/>
+      </w:pPr>
+      <w:r>
+        <w:t xml:space="preserve">지능형 성장예측·헬스케어: 수유량·수면·배변 기록으로 다음 수유 시점 예측, 또래 대비 발달 리포트</w:t>
+      </w:r>
+    </w:p>
+    <w:p>
+      <w:pPr>
+        <w:numPr>
+          <w:ilvl w:val="0"/>
+          <w:numId w:val="1005"/>
+        </w:numPr>
+        <w:pStyle w:val="Compact"/>
+      </w:pPr>
+      <w:r>
+        <w:t xml:space="preserve">스마트 완구·인지 발달 연동: 대화형 교구와 앱 연동, 개인화 학습 콘텐츠</w:t>
+      </w:r>
+    </w:p>
+    <w:bookmarkEnd w:id="27"/>
+    <w:bookmarkStart w:id="28" w:name="기능별-추천-앱"/>
+    <w:p>
+      <w:pPr>
+        <w:pStyle w:val="Heading2"/>
+      </w:pPr>
+      <w:r>
+        <w:t xml:space="preserve">3. 기능별 추천 앱</w:t>
+      </w:r>
+    </w:p>
+    <w:p>
+      <w:pPr>
+        <w:numPr>
+          <w:ilvl w:val="0"/>
+          <w:numId w:val="1006"/>
+        </w:numPr>
+        <w:pStyle w:val="Compact"/>
+      </w:pPr>
+      <w:r>
+        <w:t xml:space="preserve">수유·성장 기록: 베이비타임(터치 한 번 기록, 공동 양육자 실시간 연동), 베이비 트래커(통계 그래프, 좌/우 모유 타이머)</w:t>
+      </w:r>
+    </w:p>
+    <w:p>
+      <w:pPr>
+        <w:numPr>
+          <w:ilvl w:val="0"/>
+          <w:numId w:val="1006"/>
+        </w:numPr>
+        <w:pStyle w:val="Compact"/>
+      </w:pPr>
+      <w:r>
+        <w:t xml:space="preserve">병원·건강: 똑닥(실시간 대기, 접수·예약, 영유아 검진·예방접종), 열나요(체온·체중별 해열제 용량·간격, 교차 복용 알람)</w:t>
+      </w:r>
+    </w:p>
+    <w:bookmarkEnd w:id="28"/>
+    <w:bookmarkStart w:id="29" w:name="우리-기획에-주는-시사점-1"/>
+    <w:p>
+      <w:pPr>
+        <w:pStyle w:val="Heading2"/>
+      </w:pPr>
+      <w:r>
+        <w:t xml:space="preserve">우리 기획에 주는 시사점</w:t>
+      </w:r>
+    </w:p>
+    <w:p>
+      <w:pPr>
+        <w:numPr>
+          <w:ilvl w:val="0"/>
+          <w:numId w:val="1007"/>
+        </w:numPr>
+        <w:pStyle w:val="Compact"/>
+      </w:pPr>
+      <w:r>
+        <w:rPr>
+          <w:bCs/>
+          <w:b/>
+        </w:rPr>
+        <w:t xml:space="preserve">직접 경쟁은 적다</w:t>
+      </w:r>
+      <w:r>
+        <w:t xml:space="preserve">: 위 앱들은 기록·병원·건강·커머스 중심이고 동화·동요 콘텐츠 앱이 아니다. 동화·동요 경쟁은 핑크퐁, 베이비버스, 유튜브 키즈 등 별도로 조사해야 한다.</w:t>
+      </w:r>
+    </w:p>
+    <w:p>
+      <w:pPr>
+        <w:numPr>
+          <w:ilvl w:val="0"/>
+          <w:numId w:val="1007"/>
+        </w:numPr>
+        <w:pStyle w:val="Compact"/>
+      </w:pPr>
+      <w:r>
+        <w:rPr>
+          <w:bCs/>
+          <w:b/>
+        </w:rPr>
+        <w:t xml:space="preserve">이유식 기록은 겹친다</w:t>
+      </w:r>
+      <w:r>
+        <w:t xml:space="preserve">: 베이비타임이 이유식 기록을 이미 제공한다.</w:t>
+      </w:r>
+      <w:r>
+        <w:t xml:space="preserve"> </w:t>
+      </w:r>
+      <w:r>
+        <w:t xml:space="preserve">‘</w:t>
+      </w:r>
+      <w:r>
+        <w:t xml:space="preserve">새 재료 기록</w:t>
+      </w:r>
+      <w:r>
+        <w:t xml:space="preserve">’</w:t>
+      </w:r>
+      <w:r>
+        <w:t xml:space="preserve">(기획서 p.4)이 기존 앱과 무엇이 다른지(알레르기 반응, 도입 재료 기준 추천 등) 인터뷰·설문에서 확인해야 한다.</w:t>
+      </w:r>
+    </w:p>
+    <w:p>
+      <w:pPr>
+        <w:numPr>
+          <w:ilvl w:val="0"/>
+          <w:numId w:val="1007"/>
+        </w:numPr>
+        <w:pStyle w:val="Compact"/>
+      </w:pPr>
+      <w:r>
+        <w:rPr>
+          <w:bCs/>
+          <w:b/>
+        </w:rPr>
+        <w:t xml:space="preserve">수익 모델 참고</w:t>
+      </w:r>
+      <w:r>
+        <w:t xml:space="preserve">: 기존 앱은 광고·커머스·제휴·구독으로 수익을 낸다. 우리는 ’광고 없는 무료’를 내세우므로 수익 구조 질문(설문 F, 인터뷰 Q28)이 더 중요해진다. 커머스 연계도 검토할 수 있다.</w:t>
+      </w:r>
+    </w:p>
+    <w:p>
+      <w:pPr>
+        <w:numPr>
+          <w:ilvl w:val="0"/>
+          <w:numId w:val="1007"/>
+        </w:numPr>
+        <w:pStyle w:val="Compact"/>
+      </w:pPr>
+      <w:r>
+        <w:rPr>
+          <w:bCs/>
+          <w:b/>
+        </w:rPr>
+        <w:t xml:space="preserve">AI 트렌드의 양면성</w:t>
+      </w:r>
+      <w:r>
+        <w:t xml:space="preserve">: 시장은 AI 상담·분석을 환영하는 방향이지만, 건강 정보는 오류 시 위험하다. 이유식 면책 문구와 소아과 상담 안내(기획서 p.4, p.8)를 유지해야 한다. 아이 콘텐츠의 AI 수용도는 위 트렌드와 별개로 직접 검증이 필요하다.</w:t>
+      </w:r>
+    </w:p>
+    <w:p>
+      <w:pPr>
+        <w:numPr>
+          <w:ilvl w:val="0"/>
+          <w:numId w:val="1007"/>
+        </w:numPr>
+        <w:pStyle w:val="Compact"/>
+      </w:pPr>
+      <w:r>
+        <w:rPr>
+          <w:bCs/>
+          <w:b/>
+        </w:rPr>
+        <w:t xml:space="preserve">병원·건강 앱과의 제휴 가능성</w:t>
+      </w:r>
+      <w:r>
+        <w:t xml:space="preserve">: 똑닥, 열나요 이용 부모가 타깃과 겹치므로 후속 인터뷰 모집 채널로도 쓸 수 있다.</w:t>
+      </w:r>
+    </w:p>
+    <w:bookmarkEnd w:id="29"/>
+    <w:bookmarkEnd w:id="30"/>
     <w:sectPr/>
   </w:body>
 </w:document>
@@ -717,6 +1253,91 @@
     <w:lvl w:ilvl="8">
       <w:numFmt w:val="bullet"/>
       <w:lvlText w:val="•"/>
+      <w:lvlJc w:val="left"/>
+      <w:pPr>
+        <w:ind w:left="6480" w:hanging="480"/>
+      </w:pPr>
+    </w:lvl>
+  </w:abstractNum>
+  <w:abstractNum w:abstractNumId="99411">
+    <w:nsid w:val="A99411"/>
+    <w:multiLevelType w:val="multilevel"/>
+    <w:lvl w:ilvl="0">
+      <w:start w:val="1"/>
+      <w:numFmt w:val="decimal"/>
+      <w:lvlText w:val="%1."/>
+      <w:lvlJc w:val="left"/>
+      <w:pPr>
+        <w:ind w:left="720" w:hanging="480"/>
+      </w:pPr>
+    </w:lvl>
+    <w:lvl w:ilvl="1">
+      <w:start w:val="1"/>
+      <w:numFmt w:val="decimal"/>
+      <w:lvlText w:val="%2."/>
+      <w:lvlJc w:val="left"/>
+      <w:pPr>
+        <w:ind w:left="1440" w:hanging="480"/>
+      </w:pPr>
+    </w:lvl>
+    <w:lvl w:ilvl="2">
+      <w:start w:val="1"/>
+      <w:numFmt w:val="decimal"/>
+      <w:lvlText w:val="%3."/>
+      <w:lvlJc w:val="left"/>
+      <w:pPr>
+        <w:ind w:left="2160" w:hanging="480"/>
+      </w:pPr>
+    </w:lvl>
+    <w:lvl w:ilvl="3">
+      <w:start w:val="1"/>
+      <w:numFmt w:val="decimal"/>
+      <w:lvlText w:val="%4."/>
+      <w:lvlJc w:val="left"/>
+      <w:pPr>
+        <w:ind w:left="2880" w:hanging="480"/>
+      </w:pPr>
+    </w:lvl>
+    <w:lvl w:ilvl="4">
+      <w:start w:val="1"/>
+      <w:numFmt w:val="decimal"/>
+      <w:lvlText w:val="%5."/>
+      <w:lvlJc w:val="left"/>
+      <w:pPr>
+        <w:ind w:left="3600" w:hanging="480"/>
+      </w:pPr>
+    </w:lvl>
+    <w:lvl w:ilvl="5">
+      <w:start w:val="1"/>
+      <w:numFmt w:val="decimal"/>
+      <w:lvlText w:val="%6."/>
+      <w:lvlJc w:val="left"/>
+      <w:pPr>
+        <w:ind w:left="4320" w:hanging="480"/>
+      </w:pPr>
+    </w:lvl>
+    <w:lvl w:ilvl="6">
+      <w:start w:val="1"/>
+      <w:numFmt w:val="decimal"/>
+      <w:lvlText w:val="%7."/>
+      <w:lvlJc w:val="left"/>
+      <w:pPr>
+        <w:ind w:left="5040" w:hanging="480"/>
+      </w:pPr>
+    </w:lvl>
+    <w:lvl w:ilvl="7">
+      <w:start w:val="1"/>
+      <w:numFmt w:val="decimal"/>
+      <w:lvlText w:val="%8."/>
+      <w:lvlJc w:val="left"/>
+      <w:pPr>
+        <w:ind w:left="5760" w:hanging="480"/>
+      </w:pPr>
+    </w:lvl>
+    <w:lvl w:ilvl="8">
+      <w:start w:val="1"/>
+      <w:numFmt w:val="decimal"/>
+      <w:lvlText w:val="%9."/>
       <w:lvlJc w:val="left"/>
       <w:pPr>
         <w:ind w:left="6480" w:hanging="480"/>
@@ -737,6 +1358,42 @@
   </w:num>
   <w:num w:numId="1004">
     <w:abstractNumId w:val="991"/>
+  </w:num>
+  <w:num w:numId="1005">
+    <w:abstractNumId w:val="991"/>
+  </w:num>
+  <w:num w:numId="1006">
+    <w:abstractNumId w:val="991"/>
+  </w:num>
+  <w:num w:numId="1007">
+    <w:abstractNumId w:val="99411"/>
+    <w:lvlOverride w:ilvl="0">
+      <w:startOverride w:val="1"/>
+    </w:lvlOverride>
+    <w:lvlOverride w:ilvl="1">
+      <w:startOverride w:val="1"/>
+    </w:lvlOverride>
+    <w:lvlOverride w:ilvl="2">
+      <w:startOverride w:val="1"/>
+    </w:lvlOverride>
+    <w:lvlOverride w:ilvl="3">
+      <w:startOverride w:val="1"/>
+    </w:lvlOverride>
+    <w:lvlOverride w:ilvl="4">
+      <w:startOverride w:val="1"/>
+    </w:lvlOverride>
+    <w:lvlOverride w:ilvl="5">
+      <w:startOverride w:val="1"/>
+    </w:lvlOverride>
+    <w:lvlOverride w:ilvl="6">
+      <w:startOverride w:val="1"/>
+    </w:lvlOverride>
+    <w:lvlOverride w:ilvl="7">
+      <w:startOverride w:val="1"/>
+    </w:lvlOverride>
+    <w:lvlOverride w:ilvl="8">
+      <w:startOverride w:val="1"/>
+    </w:lvlOverride>
   </w:num>
 </w:numbering>
 </file>

</xml_diff>

<commit_message>
Add storybook/nursery-rhyme competitor research
Co-Authored-By: Claude Sonnet 5.5 <noreply@anthropic.com>
Claude-Session: https://claude.ai/code/session_01YUs4ThZR7vyJGPPKhVC9wX
</commit_message>
<xml_diff>
--- a/research/00_시장_개요.docx
+++ b/research/00_시장_개요.docx
@@ -1075,8 +1075,407 @@
         <w:t xml:space="preserve">: 똑닥, 열나요 이용 부모가 타깃과 겹치므로 후속 인터뷰 모집 채널로도 쓸 수 있다.</w:t>
       </w:r>
     </w:p>
+    <w:p>
+      <w:r>
+        <w:pict>
+          <v:rect style="width:0;height:1.5pt" o:hralign="center" o:hrstd="t" o:hr="t"/>
+        </w:pict>
+      </w:r>
+    </w:p>
     <w:bookmarkEnd w:id="29"/>
     <w:bookmarkEnd w:id="30"/>
+    <w:bookmarkStart w:id="32" w:name="동화동요-경쟁-앱-조사-2026-10-11-웹-검색-기준"/>
+    <w:p>
+      <w:pPr>
+        <w:pStyle w:val="Heading1"/>
+      </w:pPr>
+      <w:r>
+        <w:t xml:space="preserve">동화·동요 경쟁 앱 조사 (2026-10-11 웹 검색 기준)</w:t>
+      </w:r>
+    </w:p>
+    <w:p>
+      <w:pPr>
+        <w:pStyle w:val="BlockText"/>
+      </w:pPr>
+      <w:r>
+        <w:t xml:space="preserve">검색으로 확인되는 범위만 정리했습니다. 가격·광고·오프라인 여부 등은</w:t>
+      </w:r>
+      <w:r>
+        <w:t xml:space="preserve"> </w:t>
+      </w:r>
+      <w:r>
+        <w:rPr>
+          <w:bCs/>
+          <w:b/>
+        </w:rPr>
+        <w:t xml:space="preserve">스토어 상세 페이지에서 직접 확인</w:t>
+      </w:r>
+      <w:r>
+        <w:t xml:space="preserve">해야 하며, 미확인 항목은 비교표에 ’(확인 필요)’로 남겼습니다.</w:t>
+      </w:r>
+    </w:p>
+    <w:tbl>
+      <w:tblPr>
+        <w:tblStyle w:val="Table"/>
+        <w:tblW w:type="pct" w:w="5000"/>
+        <w:tblLook w:firstRow="1" w:lastRow="0" w:firstColumn="0" w:lastColumn="0" w:noHBand="0" w:noVBand="0" w:val="0020"/>
+        <w:jc w:val="start"/>
+      </w:tblPr>
+      <w:tblGrid>
+        <w:gridCol w:w="3960"/>
+        <w:gridCol w:w="3960"/>
+      </w:tblGrid>
+      <w:tr>
+        <w:trPr>
+          <w:tblHeader w:val="true"/>
+        </w:trPr>
+        <w:tc>
+          <w:tcPr/>
+          <w:p>
+            <w:pPr>
+              <w:pStyle w:val="Compact"/>
+              <w:jc w:val="left"/>
+            </w:pPr>
+            <w:r>
+              <w:t xml:space="preserve">앱</w:t>
+            </w:r>
+          </w:p>
+        </w:tc>
+        <w:tc>
+          <w:tcPr/>
+          <w:p>
+            <w:pPr>
+              <w:pStyle w:val="Compact"/>
+              <w:jc w:val="left"/>
+            </w:pPr>
+            <w:r>
+              <w:t xml:space="preserve">확인된 내용</w:t>
+            </w:r>
+          </w:p>
+        </w:tc>
+      </w:tr>
+      <w:tr>
+        <w:tc>
+          <w:tcPr/>
+          <w:p>
+            <w:pPr>
+              <w:pStyle w:val="Compact"/>
+              <w:jc w:val="left"/>
+            </w:pPr>
+            <w:r>
+              <w:t xml:space="preserve">핑크퐁플러스 / 아기상어 키즈 월드 / 핑크퐁 TV</w:t>
+            </w:r>
+          </w:p>
+        </w:tc>
+        <w:tc>
+          <w:tcPr/>
+          <w:p>
+            <w:pPr>
+              <w:pStyle w:val="Compact"/>
+              <w:jc w:val="left"/>
+            </w:pPr>
+            <w:r>
+              <w:t xml:space="preserve">앱은 무료+앱 내 구입. 핑크퐁플러스는 월 멤버십으로 유료 콘텐츠 잠금 해제, 광고·유해 콘텐츠 차단, 오리지널 콘텐츠. 핑크퐁 TV는 다운로드 영상 오프라인 시청. 요금 미확인</w:t>
+            </w:r>
+          </w:p>
+        </w:tc>
+      </w:tr>
+      <w:tr>
+        <w:tc>
+          <w:tcPr/>
+          <w:p>
+            <w:pPr>
+              <w:pStyle w:val="Compact"/>
+              <w:jc w:val="left"/>
+            </w:pPr>
+            <w:r>
+              <w:t xml:space="preserve">베이비버스</w:t>
+            </w:r>
+          </w:p>
+        </w:tc>
+        <w:tc>
+          <w:tcPr/>
+          <w:p>
+            <w:pPr>
+              <w:pStyle w:val="Compact"/>
+              <w:jc w:val="left"/>
+            </w:pPr>
+            <w:r>
+              <w:t xml:space="preserve">앱별로 1개월 6,600원, 1년 44,000원, 연속 월 9,000원, 연속 연 54,000원 등 구독 표시(앱마다 상이). 일부 앱 광고 포함</w:t>
+            </w:r>
+          </w:p>
+        </w:tc>
+      </w:tr>
+      <w:tr>
+        <w:tc>
+          <w:tcPr/>
+          <w:p>
+            <w:pPr>
+              <w:pStyle w:val="Compact"/>
+              <w:jc w:val="left"/>
+            </w:pPr>
+            <w:r>
+              <w:t xml:space="preserve">유튜브 키즈</w:t>
+            </w:r>
+          </w:p>
+        </w:tc>
+        <w:tc>
+          <w:tcPr/>
+          <w:p>
+            <w:pPr>
+              <w:pStyle w:val="Compact"/>
+              <w:jc w:val="left"/>
+            </w:pPr>
+            <w:r>
+              <w:t xml:space="preserve">한국 출시 기사 기준 타이머(종료 시 앱 잠김), 검색 설정, 암호 보호, 영상·채널 차단, 승인된 콘텐츠 모드. 광고·오프라인 정책 미확인</w:t>
+            </w:r>
+          </w:p>
+        </w:tc>
+      </w:tr>
+      <w:tr>
+        <w:tc>
+          <w:tcPr/>
+          <w:p>
+            <w:pPr>
+              <w:pStyle w:val="Compact"/>
+              <w:jc w:val="left"/>
+            </w:pPr>
+            <w:r>
+              <w:t xml:space="preserve">코코지</w:t>
+            </w:r>
+          </w:p>
+        </w:tc>
+        <w:tc>
+          <w:tcPr/>
+          <w:p>
+            <w:pPr>
+              <w:pStyle w:val="Compact"/>
+              <w:jc w:val="left"/>
+            </w:pPr>
+            <w:r>
+              <w:t xml:space="preserve">핑크퐁, 베베핀, 뽀로로, 엄마까투리, 로보카폴리 등 캐릭터 콘텐츠를 한 앱에 제공.</w:t>
+            </w:r>
+            <w:r>
+              <w:t xml:space="preserve"> </w:t>
+            </w:r>
+            <w:r>
+              <w:t xml:space="preserve">‘</w:t>
+            </w:r>
+            <w:r>
+              <w:t xml:space="preserve">코코지 올데이</w:t>
+            </w:r>
+            <w:r>
+              <w:t xml:space="preserve">’</w:t>
+            </w:r>
+            <w:r>
+              <w:t xml:space="preserve"> </w:t>
+            </w:r>
+            <w:r>
+              <w:t xml:space="preserve">구독. 가격 미확인</w:t>
+            </w:r>
+          </w:p>
+        </w:tc>
+      </w:tr>
+      <w:tr>
+        <w:tc>
+          <w:tcPr/>
+          <w:p>
+            <w:pPr>
+              <w:pStyle w:val="Compact"/>
+              <w:jc w:val="left"/>
+            </w:pPr>
+            <w:r>
+              <w:t xml:space="preserve">KidloLand</w:t>
+            </w:r>
+          </w:p>
+        </w:tc>
+        <w:tc>
+          <w:tcPr/>
+          <w:p>
+            <w:pPr>
+              <w:pStyle w:val="Compact"/>
+              <w:jc w:val="left"/>
+            </w:pPr>
+            <w:r>
+              <w:t xml:space="preserve">동요·이야기·게임 3,000개 이상, 앱 내 구입</w:t>
+            </w:r>
+          </w:p>
+        </w:tc>
+      </w:tr>
+      <w:tr>
+        <w:tc>
+          <w:tcPr/>
+          <w:p>
+            <w:pPr>
+              <w:pStyle w:val="Compact"/>
+              <w:jc w:val="left"/>
+            </w:pPr>
+            <w:r>
+              <w:t xml:space="preserve">한국 앱스토어 동화 앱</w:t>
+            </w:r>
+          </w:p>
+        </w:tc>
+        <w:tc>
+          <w:tcPr/>
+          <w:p>
+            <w:pPr>
+              <w:pStyle w:val="Compact"/>
+              <w:jc w:val="left"/>
+            </w:pPr>
+            <w:r>
+              <w:t xml:space="preserve">자장가 모드, 음성 내레이션, 부모 목소리 녹음, 무료+앱 내 구입</w:t>
+            </w:r>
+          </w:p>
+        </w:tc>
+      </w:tr>
+      <w:tr>
+        <w:tc>
+          <w:tcPr/>
+          <w:p>
+            <w:pPr>
+              <w:pStyle w:val="Compact"/>
+              <w:jc w:val="left"/>
+            </w:pPr>
+            <w:r>
+              <w:t xml:space="preserve">뽀로로 동요놀이</w:t>
+            </w:r>
+          </w:p>
+        </w:tc>
+        <w:tc>
+          <w:tcPr/>
+          <w:p>
+            <w:pPr>
+              <w:pStyle w:val="Compact"/>
+              <w:jc w:val="left"/>
+            </w:pPr>
+            <w:r>
+              <w:t xml:space="preserve">2018년 출시 기사. 현재 운영 여부 불명</w:t>
+            </w:r>
+          </w:p>
+        </w:tc>
+      </w:tr>
+    </w:tbl>
+    <w:bookmarkStart w:id="31" w:name="시사점"/>
+    <w:p>
+      <w:pPr>
+        <w:pStyle w:val="Heading2"/>
+      </w:pPr>
+      <w:r>
+        <w:t xml:space="preserve">시사점</w:t>
+      </w:r>
+    </w:p>
+    <w:p>
+      <w:pPr>
+        <w:numPr>
+          <w:ilvl w:val="0"/>
+          <w:numId w:val="1008"/>
+        </w:numPr>
+        <w:pStyle w:val="Compact"/>
+      </w:pPr>
+      <w:r>
+        <w:rPr>
+          <w:bCs/>
+          <w:b/>
+        </w:rPr>
+        <w:t xml:space="preserve">’무료 + 광고 없음’은 단독 차별점이 약할 수 있다.</w:t>
+      </w:r>
+      <w:r>
+        <w:t xml:space="preserve"> </w:t>
+      </w:r>
+      <w:r>
+        <w:t xml:space="preserve">핑크퐁은 멤버십으로 광고를 차단하고, 유튜브 키즈는 보호자 설정을 이미 갖췄다. 설문에서 갈아탈 이유가 실제로 되는지 확인해야 한다(설문 B6, C2, F1).</w:t>
+      </w:r>
+    </w:p>
+    <w:p>
+      <w:pPr>
+        <w:numPr>
+          <w:ilvl w:val="0"/>
+          <w:numId w:val="1008"/>
+        </w:numPr>
+        <w:pStyle w:val="Compact"/>
+      </w:pPr>
+      <w:r>
+        <w:rPr>
+          <w:bCs/>
+          <w:b/>
+        </w:rPr>
+        <w:t xml:space="preserve">잠자리 모드 유사 기능이 이미 있다.</w:t>
+      </w:r>
+      <w:r>
+        <w:t xml:space="preserve"> </w:t>
+      </w:r>
+      <w:r>
+        <w:t xml:space="preserve">동화 앱 중 자장가 모드를 내세운 앱이 있고 유튜브 키즈에도 타이머가 있다. 인터뷰 Q21에서 기존 방식과 비교해 물어볼 것.</w:t>
+      </w:r>
+    </w:p>
+    <w:p>
+      <w:pPr>
+        <w:numPr>
+          <w:ilvl w:val="0"/>
+          <w:numId w:val="1008"/>
+        </w:numPr>
+        <w:pStyle w:val="Compact"/>
+      </w:pPr>
+      <w:r>
+        <w:rPr>
+          <w:bCs/>
+          <w:b/>
+        </w:rPr>
+        <w:t xml:space="preserve">통합 앱 선례는 코코지다.</w:t>
+      </w:r>
+      <w:r>
+        <w:t xml:space="preserve"> </w:t>
+      </w:r>
+      <w:r>
+        <w:t xml:space="preserve">여러 IP를 모은 오디오 앱이므로, 사용 경험자를 인터뷰하면 통합 앱에 대한 반응을 알 수 있다.</w:t>
+      </w:r>
+    </w:p>
+    <w:p>
+      <w:pPr>
+        <w:numPr>
+          <w:ilvl w:val="0"/>
+          <w:numId w:val="1008"/>
+        </w:numPr>
+        <w:pStyle w:val="Compact"/>
+      </w:pPr>
+      <w:r>
+        <w:rPr>
+          <w:bCs/>
+          <w:b/>
+        </w:rPr>
+        <w:t xml:space="preserve">가장 큰 격차는 캐릭터 IP 인지도다.</w:t>
+      </w:r>
+      <w:r>
+        <w:t xml:space="preserve"> </w:t>
+      </w:r>
+      <w:r>
+        <w:t xml:space="preserve">기획서의 자체 캐릭터 IP 전략(p.2)이 부모에게 설득력이 있는지 설문에서 물어볼 필요가 있다.</w:t>
+      </w:r>
+    </w:p>
+    <w:p>
+      <w:pPr>
+        <w:numPr>
+          <w:ilvl w:val="0"/>
+          <w:numId w:val="1008"/>
+        </w:numPr>
+        <w:pStyle w:val="Compact"/>
+      </w:pPr>
+      <w:r>
+        <w:rPr>
+          <w:bCs/>
+          <w:b/>
+        </w:rPr>
+        <w:t xml:space="preserve">이유식을 함께 제공하는 앱은 이번 조사에서 확인되지 않았다.</w:t>
+      </w:r>
+      <w:r>
+        <w:t xml:space="preserve"> </w:t>
+      </w:r>
+      <w:r>
+        <w:t xml:space="preserve">다만 검색 범위가 좁아 ’없다’고 단정할 수는 없다. 이유식+콘텐츠 통합이 빈틈인지 별도 확인이 필요하다.</w:t>
+      </w:r>
+    </w:p>
+    <w:bookmarkEnd w:id="31"/>
+    <w:bookmarkEnd w:id="32"/>
     <w:sectPr/>
   </w:body>
 </w:document>
@@ -1366,6 +1765,36 @@
     <w:abstractNumId w:val="991"/>
   </w:num>
   <w:num w:numId="1007">
+    <w:abstractNumId w:val="99411"/>
+    <w:lvlOverride w:ilvl="0">
+      <w:startOverride w:val="1"/>
+    </w:lvlOverride>
+    <w:lvlOverride w:ilvl="1">
+      <w:startOverride w:val="1"/>
+    </w:lvlOverride>
+    <w:lvlOverride w:ilvl="2">
+      <w:startOverride w:val="1"/>
+    </w:lvlOverride>
+    <w:lvlOverride w:ilvl="3">
+      <w:startOverride w:val="1"/>
+    </w:lvlOverride>
+    <w:lvlOverride w:ilvl="4">
+      <w:startOverride w:val="1"/>
+    </w:lvlOverride>
+    <w:lvlOverride w:ilvl="5">
+      <w:startOverride w:val="1"/>
+    </w:lvlOverride>
+    <w:lvlOverride w:ilvl="6">
+      <w:startOverride w:val="1"/>
+    </w:lvlOverride>
+    <w:lvlOverride w:ilvl="7">
+      <w:startOverride w:val="1"/>
+    </w:lvlOverride>
+    <w:lvlOverride w:ilvl="8">
+      <w:startOverride w:val="1"/>
+    </w:lvlOverride>
+  </w:num>
+  <w:num w:numId="1008">
     <w:abstractNumId w:val="99411"/>
     <w:lvlOverride w:ilvl="0">
       <w:startOverride w:val="1"/>

</xml_diff>

<commit_message>
Add RAG personalized story generation and Typecast narration proposal
Co-Authored-By: Claude Sonnet 5.5 <noreply@anthropic.com>
Claude-Session: https://claude.ai/code/session_01YUs4ThZR7vyJGPPKhVC9wX
</commit_message>
<xml_diff>
--- a/research/00_시장_개요.docx
+++ b/research/00_시장_개요.docx
@@ -84,6 +84,14 @@
         <w:tblW w:type="auto" w:w="0"/>
         <w:tblLook w:firstRow="1" w:lastRow="0" w:firstColumn="0" w:lastColumn="0" w:noHBand="0" w:noVBand="0" w:val="0020"/>
         <w:jc w:val="start"/>
+        <w:tblBorders>
+          <w:top w:val="single" w:sz="4" w:color="BBBBBB"/>
+          <w:left w:val="single" w:sz="4" w:color="BBBBBB"/>
+          <w:bottom w:val="single" w:sz="4" w:color="BBBBBB"/>
+          <w:right w:val="single" w:sz="4" w:color="BBBBBB"/>
+          <w:insideH w:val="single" w:sz="4" w:color="BBBBBB"/>
+          <w:insideV w:val="single" w:sz="4" w:color="BBBBBB"/>
+        </w:tblBorders>
       </w:tblPr>
       <w:tblGrid>
         <w:gridCol w:w="3960"/>
@@ -101,6 +109,9 @@
               <w:jc w:val="left"/>
             </w:pPr>
             <w:r>
+              <w:rPr>
+                <w:b/>
+              </w:rPr>
               <w:t xml:space="preserve">항목</w:t>
             </w:r>
           </w:p>
@@ -113,6 +124,9 @@
               <w:jc w:val="left"/>
             </w:pPr>
             <w:r>
+              <w:rPr>
+                <w:b/>
+              </w:rPr>
               <w:t xml:space="preserve">내용</w:t>
             </w:r>
           </w:p>
@@ -601,6 +615,14 @@
         <w:tblW w:type="pct" w:w="5000"/>
         <w:tblLook w:firstRow="1" w:lastRow="0" w:firstColumn="0" w:lastColumn="0" w:noHBand="0" w:noVBand="0" w:val="0020"/>
         <w:jc w:val="start"/>
+        <w:tblBorders>
+          <w:top w:val="single" w:sz="4" w:color="BBBBBB"/>
+          <w:left w:val="single" w:sz="4" w:color="BBBBBB"/>
+          <w:bottom w:val="single" w:sz="4" w:color="BBBBBB"/>
+          <w:right w:val="single" w:sz="4" w:color="BBBBBB"/>
+          <w:insideH w:val="single" w:sz="4" w:color="BBBBBB"/>
+          <w:insideV w:val="single" w:sz="4" w:color="BBBBBB"/>
+        </w:tblBorders>
       </w:tblPr>
       <w:tblGrid>
         <w:gridCol w:w="2640"/>
@@ -619,6 +641,9 @@
               <w:jc w:val="left"/>
             </w:pPr>
             <w:r>
+              <w:rPr>
+                <w:b/>
+              </w:rPr>
               <w:t xml:space="preserve">앱</w:t>
             </w:r>
           </w:p>
@@ -631,6 +656,9 @@
               <w:jc w:val="left"/>
             </w:pPr>
             <w:r>
+              <w:rPr>
+                <w:b/>
+              </w:rPr>
               <w:t xml:space="preserve">주요 타깃·카테고리</w:t>
             </w:r>
           </w:p>
@@ -643,6 +671,9 @@
               <w:jc w:val="left"/>
             </w:pPr>
             <w:r>
+              <w:rPr>
+                <w:b/>
+              </w:rPr>
               <w:t xml:space="preserve">특징 및 수익 구조</w:t>
             </w:r>
           </w:p>
@@ -1120,6 +1151,14 @@
         <w:tblW w:type="pct" w:w="5000"/>
         <w:tblLook w:firstRow="1" w:lastRow="0" w:firstColumn="0" w:lastColumn="0" w:noHBand="0" w:noVBand="0" w:val="0020"/>
         <w:jc w:val="start"/>
+        <w:tblBorders>
+          <w:top w:val="single" w:sz="4" w:color="BBBBBB"/>
+          <w:left w:val="single" w:sz="4" w:color="BBBBBB"/>
+          <w:bottom w:val="single" w:sz="4" w:color="BBBBBB"/>
+          <w:right w:val="single" w:sz="4" w:color="BBBBBB"/>
+          <w:insideH w:val="single" w:sz="4" w:color="BBBBBB"/>
+          <w:insideV w:val="single" w:sz="4" w:color="BBBBBB"/>
+        </w:tblBorders>
       </w:tblPr>
       <w:tblGrid>
         <w:gridCol w:w="3960"/>
@@ -1137,6 +1176,9 @@
               <w:jc w:val="left"/>
             </w:pPr>
             <w:r>
+              <w:rPr>
+                <w:b/>
+              </w:rPr>
               <w:t xml:space="preserve">앱</w:t>
             </w:r>
           </w:p>
@@ -1149,6 +1191,9 @@
               <w:jc w:val="left"/>
             </w:pPr>
             <w:r>
+              <w:rPr>
+                <w:b/>
+              </w:rPr>
               <w:t xml:space="preserve">확인된 내용</w:t>
             </w:r>
           </w:p>
@@ -1474,8 +1519,306 @@
         <w:t xml:space="preserve">다만 검색 범위가 좁아 ’없다’고 단정할 수는 없다. 이유식+콘텐츠 통합이 빈틈인지 별도 확인이 필요하다.</w:t>
       </w:r>
     </w:p>
+    <w:p>
+      <w:r>
+        <w:pict>
+          <v:rect style="width:0;height:1.5pt" o:hralign="center" o:hrstd="t" o:hr="t"/>
+        </w:pict>
+      </w:r>
+    </w:p>
     <w:bookmarkEnd w:id="31"/>
     <w:bookmarkEnd w:id="32"/>
+    <w:bookmarkStart w:id="33" w:name="추가-자료-멘토링-자료의-벤치마킹-대상"/>
+    <w:p>
+      <w:pPr>
+        <w:pStyle w:val="Heading1"/>
+      </w:pPr>
+      <w:r>
+        <w:t xml:space="preserve">추가 자료: 멘토링 자료의 벤치마킹 대상</w:t>
+      </w:r>
+    </w:p>
+    <w:p>
+      <w:pPr>
+        <w:pStyle w:val="FirstParagraph"/>
+      </w:pPr>
+      <w:r>
+        <w:t xml:space="preserve">멘토링 자료(</w:t>
+      </w:r>
+      <w:r>
+        <w:t xml:space="preserve">‘</w:t>
+      </w:r>
+      <w:r>
+        <w:t xml:space="preserve">주제2: 올인원 육아 앱 서비스</w:t>
+      </w:r>
+      <w:r>
+        <w:t xml:space="preserve">’</w:t>
+      </w:r>
+      <w:r>
+        <w:t xml:space="preserve">)에 적힌 벤치마킹 대상이다. 내용은 아직 조사하지 않았고 비교표에 행만 추가했다.</w:t>
+      </w:r>
+    </w:p>
+    <w:tbl>
+      <w:tblPr>
+        <w:tblStyle w:val="Table"/>
+        <w:tblW w:type="pct" w:w="5000"/>
+        <w:tblLook w:firstRow="1" w:lastRow="0" w:firstColumn="0" w:lastColumn="0" w:noHBand="0" w:noVBand="0" w:val="0020"/>
+        <w:jc w:val="start"/>
+        <w:tblBorders>
+          <w:top w:val="single" w:sz="4" w:color="BBBBBB"/>
+          <w:left w:val="single" w:sz="4" w:color="BBBBBB"/>
+          <w:bottom w:val="single" w:sz="4" w:color="BBBBBB"/>
+          <w:right w:val="single" w:sz="4" w:color="BBBBBB"/>
+          <w:insideH w:val="single" w:sz="4" w:color="BBBBBB"/>
+          <w:insideV w:val="single" w:sz="4" w:color="BBBBBB"/>
+        </w:tblBorders>
+      </w:tblPr>
+      <w:tblGrid>
+        <w:gridCol w:w="2640"/>
+        <w:gridCol w:w="2640"/>
+        <w:gridCol w:w="2640"/>
+      </w:tblGrid>
+      <w:tr>
+        <w:trPr>
+          <w:tblHeader w:val="true"/>
+        </w:trPr>
+        <w:tc>
+          <w:tcPr/>
+          <w:p>
+            <w:pPr>
+              <w:pStyle w:val="Compact"/>
+              <w:jc w:val="left"/>
+            </w:pPr>
+            <w:r>
+              <w:rPr>
+                <w:b/>
+              </w:rPr>
+              <w:t xml:space="preserve">영역</w:t>
+            </w:r>
+          </w:p>
+        </w:tc>
+        <w:tc>
+          <w:tcPr/>
+          <w:p>
+            <w:pPr>
+              <w:pStyle w:val="Compact"/>
+              <w:jc w:val="left"/>
+            </w:pPr>
+            <w:r>
+              <w:rPr>
+                <w:b/>
+              </w:rPr>
+              <w:t xml:space="preserve">대상</w:t>
+            </w:r>
+          </w:p>
+        </w:tc>
+        <w:tc>
+          <w:tcPr/>
+          <w:p>
+            <w:pPr>
+              <w:pStyle w:val="Compact"/>
+              <w:jc w:val="left"/>
+            </w:pPr>
+            <w:r>
+              <w:rPr>
+                <w:b/>
+              </w:rPr>
+              <w:t xml:space="preserve">확인할 점</w:t>
+            </w:r>
+          </w:p>
+        </w:tc>
+      </w:tr>
+      <w:tr>
+        <w:tc>
+          <w:tcPr/>
+          <w:p>
+            <w:pPr>
+              <w:pStyle w:val="Compact"/>
+              <w:jc w:val="left"/>
+            </w:pPr>
+            <w:r>
+              <w:t xml:space="preserve">울음 분석</w:t>
+            </w:r>
+          </w:p>
+        </w:tc>
+        <w:tc>
+          <w:tcPr/>
+          <w:p>
+            <w:pPr>
+              <w:pStyle w:val="Compact"/>
+              <w:jc w:val="left"/>
+            </w:pPr>
+            <w:r>
+              <w:t xml:space="preserve">babycryinterpreter.com</w:t>
+            </w:r>
+          </w:p>
+        </w:tc>
+        <w:tc>
+          <w:tcPr/>
+          <w:p>
+            <w:pPr>
+              <w:pStyle w:val="Compact"/>
+              <w:jc w:val="left"/>
+            </w:pPr>
+            <w:r>
+              <w:t xml:space="preserve">정확도 근거, 가격, 오탐·미탐 처리</w:t>
+            </w:r>
+          </w:p>
+        </w:tc>
+      </w:tr>
+      <w:tr>
+        <w:tc>
+          <w:tcPr/>
+          <w:p>
+            <w:pPr>
+              <w:pStyle w:val="Compact"/>
+              <w:jc w:val="left"/>
+            </w:pPr>
+            <w:r>
+              <w:t xml:space="preserve">이유식 레시피</w:t>
+            </w:r>
+          </w:p>
+        </w:tc>
+        <w:tc>
+          <w:tcPr/>
+          <w:p>
+            <w:pPr>
+              <w:pStyle w:val="Compact"/>
+              <w:jc w:val="left"/>
+            </w:pPr>
+            <w:r>
+              <w:t xml:space="preserve">스푼타임 등</w:t>
+            </w:r>
+          </w:p>
+        </w:tc>
+        <w:tc>
+          <w:tcPr/>
+          <w:p>
+            <w:pPr>
+              <w:pStyle w:val="Compact"/>
+              <w:jc w:val="left"/>
+            </w:pPr>
+            <w:r>
+              <w:t xml:space="preserve">단계별 구성, 재료 기록, 수익 모델</w:t>
+            </w:r>
+          </w:p>
+        </w:tc>
+      </w:tr>
+      <w:tr>
+        <w:tc>
+          <w:tcPr/>
+          <w:p>
+            <w:pPr>
+              <w:pStyle w:val="Compact"/>
+              <w:jc w:val="left"/>
+            </w:pPr>
+            <w:r>
+              <w:t xml:space="preserve">기록·생활 패턴 관리</w:t>
+            </w:r>
+          </w:p>
+        </w:tc>
+        <w:tc>
+          <w:tcPr/>
+          <w:p>
+            <w:pPr>
+              <w:pStyle w:val="Compact"/>
+              <w:jc w:val="left"/>
+            </w:pPr>
+            <w:r>
+              <w:t xml:space="preserve">삐요로그</w:t>
+            </w:r>
+          </w:p>
+        </w:tc>
+        <w:tc>
+          <w:tcPr/>
+          <w:p>
+            <w:pPr>
+              <w:pStyle w:val="Compact"/>
+              <w:jc w:val="left"/>
+            </w:pPr>
+            <w:r>
+              <w:t xml:space="preserve">기록 항목, 통계, 공동 양육자 연동</w:t>
+            </w:r>
+          </w:p>
+        </w:tc>
+      </w:tr>
+      <w:tr>
+        <w:tc>
+          <w:tcPr/>
+          <w:p>
+            <w:pPr>
+              <w:pStyle w:val="Compact"/>
+              <w:jc w:val="left"/>
+            </w:pPr>
+            <w:r>
+              <w:t xml:space="preserve">병원 예약</w:t>
+            </w:r>
+          </w:p>
+        </w:tc>
+        <w:tc>
+          <w:tcPr/>
+          <w:p>
+            <w:pPr>
+              <w:pStyle w:val="Compact"/>
+              <w:jc w:val="left"/>
+            </w:pPr>
+            <w:r>
+              <w:t xml:space="preserve">열나요</w:t>
+            </w:r>
+          </w:p>
+        </w:tc>
+        <w:tc>
+          <w:tcPr/>
+          <w:p>
+            <w:pPr>
+              <w:pStyle w:val="Compact"/>
+              <w:jc w:val="left"/>
+            </w:pPr>
+            <w:r>
+              <w:t xml:space="preserve">(앞 절에서 일부 정리됨)</w:t>
+            </w:r>
+          </w:p>
+        </w:tc>
+      </w:tr>
+      <w:tr>
+        <w:tc>
+          <w:tcPr/>
+          <w:p>
+            <w:pPr>
+              <w:pStyle w:val="Compact"/>
+              <w:jc w:val="left"/>
+            </w:pPr>
+            <w:r>
+              <w:t xml:space="preserve">주차별 가이드</w:t>
+            </w:r>
+          </w:p>
+        </w:tc>
+        <w:tc>
+          <w:tcPr/>
+          <w:p>
+            <w:pPr>
+              <w:pStyle w:val="Compact"/>
+              <w:jc w:val="left"/>
+            </w:pPr>
+            <w:r>
+              <w:t xml:space="preserve">베이비빌리</w:t>
+            </w:r>
+          </w:p>
+        </w:tc>
+        <w:tc>
+          <w:tcPr/>
+          <w:p>
+            <w:pPr>
+              <w:pStyle w:val="Compact"/>
+              <w:jc w:val="left"/>
+            </w:pPr>
+            <w:r>
+              <w:t xml:space="preserve">(앞 절에서 일부 정리됨)</w:t>
+            </w:r>
+          </w:p>
+        </w:tc>
+      </w:tr>
+    </w:tbl>
+    <w:bookmarkEnd w:id="33"/>
     <w:sectPr/>
   </w:body>
 </w:document>
@@ -1848,6 +2191,10 @@
   <w:style w:default="1" w:styleId="Normal" w:type="paragraph">
     <w:name w:val="Normal"/>
     <w:qFormat/>
+    <w:rPr>
+      <w:rFonts w:ascii="WenQuanYi Zen Hei" w:hAnsi="WenQuanYi Zen Hei" w:eastAsia="WenQuanYi Zen Hei" w:cs="WenQuanYi Zen Hei"/>
+      <w:sz w:val="20"/>
+    </w:rPr>
   </w:style>
   <w:style w:styleId="BodyText" w:type="paragraph">
     <w:name w:val="Body Text"/>
@@ -1857,12 +2204,18 @@
       <w:spacing w:after="180" w:before="180"/>
     </w:pPr>
     <w:qFormat/>
+    <w:rPr>
+      <w:rFonts w:ascii="WenQuanYi Zen Hei" w:hAnsi="WenQuanYi Zen Hei" w:eastAsia="WenQuanYi Zen Hei" w:cs="WenQuanYi Zen Hei"/>
+    </w:rPr>
   </w:style>
   <w:style w:customStyle="1" w:styleId="FirstParagraph" w:type="paragraph">
     <w:name w:val="First Paragraph"/>
     <w:basedOn w:val="BodyText"/>
     <w:next w:val="BodyText"/>
     <w:qFormat/>
+    <w:rPr>
+      <w:rFonts w:ascii="WenQuanYi Zen Hei" w:hAnsi="WenQuanYi Zen Hei" w:eastAsia="WenQuanYi Zen Hei" w:cs="WenQuanYi Zen Hei"/>
+    </w:rPr>
   </w:style>
   <w:style w:customStyle="1" w:styleId="Compact" w:type="paragraph">
     <w:name w:val="Compact"/>
@@ -1871,6 +2224,9 @@
     <w:pPr>
       <w:spacing w:after="36" w:before="36"/>
     </w:pPr>
+    <w:rPr>
+      <w:rFonts w:ascii="WenQuanYi Zen Hei" w:hAnsi="WenQuanYi Zen Hei" w:eastAsia="WenQuanYi Zen Hei" w:cs="WenQuanYi Zen Hei"/>
+    </w:rPr>
   </w:style>
   <w:style w:styleId="Title" w:type="paragraph">
     <w:name w:val="Title"/>
@@ -1884,7 +2240,7 @@
       <w:jc w:val="center"/>
     </w:pPr>
     <w:rPr>
-      <w:rFonts w:asciiTheme="majorHAnsi" w:cstheme="majorBidi" w:eastAsiaTheme="majorEastAsia" w:hAnsiTheme="majorHAnsi"/>
+      <w:rFonts w:asciiTheme="majorHAnsi" w:cstheme="majorBidi" w:eastAsiaTheme="majorEastAsia" w:hAnsiTheme="majorHAnsi" w:ascii="WenQuanYi Zen Hei" w:hAnsi="WenQuanYi Zen Hei" w:eastAsia="WenQuanYi Zen Hei" w:cs="WenQuanYi Zen Hei"/>
       <w:b/>
       <w:bCs/>
       <w:color w:themeColor="accent1" w:themeShade="B5" w:val="345A8A"/>
@@ -1904,6 +2260,7 @@
       <w:jc w:val="center"/>
     </w:pPr>
     <w:rPr>
+      <w:rFonts w:ascii="WenQuanYi Zen Hei" w:hAnsi="WenQuanYi Zen Hei" w:eastAsia="WenQuanYi Zen Hei" w:cs="WenQuanYi Zen Hei"/>
       <w:sz w:val="30"/>
       <w:szCs w:val="30"/>
     </w:rPr>
@@ -1917,6 +2274,9 @@
       <w:keepLines/>
       <w:jc w:val="center"/>
     </w:pPr>
+    <w:rPr>
+      <w:rFonts w:ascii="WenQuanYi Zen Hei" w:hAnsi="WenQuanYi Zen Hei" w:eastAsia="WenQuanYi Zen Hei" w:cs="WenQuanYi Zen Hei"/>
+    </w:rPr>
   </w:style>
   <w:style w:styleId="Date" w:type="paragraph">
     <w:name w:val="Date"/>
@@ -1927,6 +2287,9 @@
       <w:keepLines/>
       <w:jc w:val="center"/>
     </w:pPr>
+    <w:rPr>
+      <w:rFonts w:ascii="WenQuanYi Zen Hei" w:hAnsi="WenQuanYi Zen Hei" w:eastAsia="WenQuanYi Zen Hei" w:cs="WenQuanYi Zen Hei"/>
+    </w:rPr>
   </w:style>
   <w:style w:customStyle="1" w:styleId="AbstractTitle" w:type="paragraph">
     <w:name w:val="Abstract Title"/>
@@ -1942,6 +2305,7 @@
     <w:rPr>
       <w:sz w:val="20"/>
       <w:szCs w:val="20"/>
+      <w:rFonts w:ascii="WenQuanYi Zen Hei" w:hAnsi="WenQuanYi Zen Hei" w:eastAsia="WenQuanYi Zen Hei" w:cs="WenQuanYi Zen Hei"/>
       <w:b/>
       <w:color w:val="345A8A"/>
       &gt;
@@ -1958,6 +2322,7 @@
       <w:spacing w:after="300" w:before="100"/>
     </w:pPr>
     <w:rPr>
+      <w:rFonts w:ascii="WenQuanYi Zen Hei" w:hAnsi="WenQuanYi Zen Hei" w:eastAsia="WenQuanYi Zen Hei" w:cs="WenQuanYi Zen Hei"/>
       <w:sz w:val="20"/>
       <w:szCs w:val="20"/>
     </w:rPr>
@@ -1968,7 +2333,9 @@
     <w:next w:val="Bibliography"/>
     <w:qFormat/>
     <w:pPr/>
-    <w:rPr/>
+    <w:rPr>
+      <w:rFonts w:ascii="WenQuanYi Zen Hei" w:hAnsi="WenQuanYi Zen Hei" w:eastAsia="WenQuanYi Zen Hei" w:cs="WenQuanYi Zen Hei"/>
+    </w:rPr>
   </w:style>
   <w:style w:styleId="Heading1" w:type="paragraph">
     <w:name w:val="Heading 1"/>
@@ -1983,7 +2350,7 @@
       <w:outlineLvl w:val="0"/>
     </w:pPr>
     <w:rPr>
-      <w:rFonts w:asciiTheme="majorHAnsi" w:cstheme="majorBidi" w:eastAsiaTheme="majorEastAsia" w:hAnsiTheme="majorHAnsi"/>
+      <w:rFonts w:asciiTheme="majorHAnsi" w:cstheme="majorBidi" w:eastAsiaTheme="majorEastAsia" w:hAnsiTheme="majorHAnsi" w:ascii="WenQuanYi Zen Hei" w:hAnsi="WenQuanYi Zen Hei" w:eastAsia="WenQuanYi Zen Hei" w:cs="WenQuanYi Zen Hei"/>
       <w:b/>
       <w:bCs/>
       <w:color w:themeColor="accent1" w:val="4F81BD"/>
@@ -2005,7 +2372,7 @@
       <w:outlineLvl w:val="1"/>
     </w:pPr>
     <w:rPr>
-      <w:rFonts w:asciiTheme="majorHAnsi" w:cstheme="majorBidi" w:eastAsiaTheme="majorEastAsia" w:hAnsiTheme="majorHAnsi"/>
+      <w:rFonts w:asciiTheme="majorHAnsi" w:cstheme="majorBidi" w:eastAsiaTheme="majorEastAsia" w:hAnsiTheme="majorHAnsi" w:ascii="WenQuanYi Zen Hei" w:hAnsi="WenQuanYi Zen Hei" w:eastAsia="WenQuanYi Zen Hei" w:cs="WenQuanYi Zen Hei"/>
       <w:b/>
       <w:bCs/>
       <w:color w:themeColor="accent1" w:val="4F81BD"/>
@@ -2027,7 +2394,7 @@
       <w:outlineLvl w:val="2"/>
     </w:pPr>
     <w:rPr>
-      <w:rFonts w:asciiTheme="majorHAnsi" w:cstheme="majorBidi" w:eastAsiaTheme="majorEastAsia" w:hAnsiTheme="majorHAnsi"/>
+      <w:rFonts w:asciiTheme="majorHAnsi" w:cstheme="majorBidi" w:eastAsiaTheme="majorEastAsia" w:hAnsiTheme="majorHAnsi" w:ascii="WenQuanYi Zen Hei" w:hAnsi="WenQuanYi Zen Hei" w:eastAsia="WenQuanYi Zen Hei" w:cs="WenQuanYi Zen Hei"/>
       <w:b/>
       <w:bCs/>
       <w:color w:themeColor="accent1" w:val="4F81BD"/>
@@ -2049,7 +2416,7 @@
       <w:outlineLvl w:val="3"/>
     </w:pPr>
     <w:rPr>
-      <w:rFonts w:asciiTheme="majorHAnsi" w:cstheme="majorBidi" w:eastAsiaTheme="majorEastAsia" w:hAnsiTheme="majorHAnsi"/>
+      <w:rFonts w:asciiTheme="majorHAnsi" w:cstheme="majorBidi" w:eastAsiaTheme="majorEastAsia" w:hAnsiTheme="majorHAnsi" w:ascii="WenQuanYi Zen Hei" w:hAnsi="WenQuanYi Zen Hei" w:eastAsia="WenQuanYi Zen Hei" w:cs="WenQuanYi Zen Hei"/>
       <w:i/>
       <w:bCs/>
       <w:color w:themeColor="accent1" w:val="4F81BD"/>
@@ -2071,7 +2438,7 @@
       <w:outlineLvl w:val="4"/>
     </w:pPr>
     <w:rPr>
-      <w:rFonts w:asciiTheme="majorHAnsi" w:cstheme="majorBidi" w:eastAsiaTheme="majorEastAsia" w:hAnsiTheme="majorHAnsi"/>
+      <w:rFonts w:asciiTheme="majorHAnsi" w:cstheme="majorBidi" w:eastAsiaTheme="majorEastAsia" w:hAnsiTheme="majorHAnsi" w:ascii="WenQuanYi Zen Hei" w:hAnsi="WenQuanYi Zen Hei" w:eastAsia="WenQuanYi Zen Hei" w:cs="WenQuanYi Zen Hei"/>
       <w:iCs/>
       <w:color w:themeColor="accent1" w:val="4F81BD"/>
       <w:sz w:val="24"/>
@@ -2092,7 +2459,7 @@
       <w:outlineLvl w:val="5"/>
     </w:pPr>
     <w:rPr>
-      <w:rFonts w:asciiTheme="majorHAnsi" w:cstheme="majorBidi" w:eastAsiaTheme="majorEastAsia" w:hAnsiTheme="majorHAnsi"/>
+      <w:rFonts w:asciiTheme="majorHAnsi" w:cstheme="majorBidi" w:eastAsiaTheme="majorEastAsia" w:hAnsiTheme="majorHAnsi" w:ascii="WenQuanYi Zen Hei" w:hAnsi="WenQuanYi Zen Hei" w:eastAsia="WenQuanYi Zen Hei" w:cs="WenQuanYi Zen Hei"/>
       <w:color w:themeColor="accent1" w:val="4F81BD"/>
       <w:sz w:val="24"/>
       <w:szCs w:val="24"/>
@@ -2112,7 +2479,7 @@
       <w:outlineLvl w:val="6"/>
     </w:pPr>
     <w:rPr>
-      <w:rFonts w:asciiTheme="majorHAnsi" w:cstheme="majorBidi" w:eastAsiaTheme="majorEastAsia" w:hAnsiTheme="majorHAnsi"/>
+      <w:rFonts w:asciiTheme="majorHAnsi" w:cstheme="majorBidi" w:eastAsiaTheme="majorEastAsia" w:hAnsiTheme="majorHAnsi" w:ascii="WenQuanYi Zen Hei" w:hAnsi="WenQuanYi Zen Hei" w:eastAsia="WenQuanYi Zen Hei" w:cs="WenQuanYi Zen Hei"/>
       <w:color w:themeColor="accent1" w:val="4F81BD"/>
       <w:sz w:val="24"/>
       <w:szCs w:val="24"/>
@@ -2132,7 +2499,7 @@
       <w:outlineLvl w:val="7"/>
     </w:pPr>
     <w:rPr>
-      <w:rFonts w:asciiTheme="majorHAnsi" w:cstheme="majorBidi" w:eastAsiaTheme="majorEastAsia" w:hAnsiTheme="majorHAnsi"/>
+      <w:rFonts w:asciiTheme="majorHAnsi" w:cstheme="majorBidi" w:eastAsiaTheme="majorEastAsia" w:hAnsiTheme="majorHAnsi" w:ascii="WenQuanYi Zen Hei" w:hAnsi="WenQuanYi Zen Hei" w:eastAsia="WenQuanYi Zen Hei" w:cs="WenQuanYi Zen Hei"/>
       <w:color w:themeColor="accent1" w:val="4F81BD"/>
       <w:sz w:val="24"/>
       <w:szCs w:val="24"/>
@@ -2152,7 +2519,7 @@
       <w:outlineLvl w:val="8"/>
     </w:pPr>
     <w:rPr>
-      <w:rFonts w:asciiTheme="majorHAnsi" w:cstheme="majorBidi" w:eastAsiaTheme="majorEastAsia" w:hAnsiTheme="majorHAnsi"/>
+      <w:rFonts w:asciiTheme="majorHAnsi" w:cstheme="majorBidi" w:eastAsiaTheme="majorEastAsia" w:hAnsiTheme="majorHAnsi" w:ascii="WenQuanYi Zen Hei" w:hAnsi="WenQuanYi Zen Hei" w:eastAsia="WenQuanYi Zen Hei" w:cs="WenQuanYi Zen Hei"/>
       <w:color w:themeColor="accent1" w:val="4F81BD"/>
       <w:sz w:val="24"/>
       <w:szCs w:val="24"/>
@@ -2169,6 +2536,9 @@
       <w:spacing w:after="100" w:before="100"/>
       <w:ind w:firstLine="0" w:left="480" w:right="480"/>
     </w:pPr>
+    <w:rPr>
+      <w:rFonts w:ascii="WenQuanYi Zen Hei" w:hAnsi="WenQuanYi Zen Hei" w:eastAsia="WenQuanYi Zen Hei" w:cs="WenQuanYi Zen Hei"/>
+    </w:rPr>
   </w:style>
   <w:style w:styleId="FootnoteText" w:type="paragraph">
     <w:name w:val="Footnote Text"/>
@@ -2177,11 +2547,17 @@
     <w:uiPriority w:val="9"/>
     <w:unhideWhenUsed/>
     <w:qFormat/>
+    <w:rPr>
+      <w:rFonts w:ascii="WenQuanYi Zen Hei" w:hAnsi="WenQuanYi Zen Hei" w:eastAsia="WenQuanYi Zen Hei" w:cs="WenQuanYi Zen Hei"/>
+    </w:rPr>
   </w:style>
   <w:style w:default="1" w:styleId="DefaultParagraphFont" w:type="character">
     <w:name w:val="Default Paragraph Font"/>
     <w:semiHidden/>
     <w:unhideWhenUsed/>
+    <w:rPr>
+      <w:rFonts w:ascii="WenQuanYi Zen Hei" w:hAnsi="WenQuanYi Zen Hei" w:eastAsia="WenQuanYi Zen Hei" w:cs="WenQuanYi Zen Hei"/>
+    </w:rPr>
   </w:style>
   <w:style w:default="1" w:styleId="Table" w:type="table">
     <w:name w:val="Table"/>
@@ -2189,6 +2565,9 @@
     <w:semiHidden/>
     <w:unhideWhenUsed/>
     <w:qFormat/>
+    <w:rPr>
+      <w:rFonts w:ascii="WenQuanYi Zen Hei" w:hAnsi="WenQuanYi Zen Hei" w:eastAsia="WenQuanYi Zen Hei" w:cs="WenQuanYi Zen Hei"/>
+    </w:rPr>
     <w:tblPr>
       <w:tblInd w:type="dxa" w:w="0"/>
       <w:tblCellMar>
@@ -2224,12 +2603,16 @@
       <w:spacing w:after="0"/>
     </w:pPr>
     <w:rPr>
+      <w:rFonts w:ascii="WenQuanYi Zen Hei" w:hAnsi="WenQuanYi Zen Hei" w:eastAsia="WenQuanYi Zen Hei" w:cs="WenQuanYi Zen Hei"/>
       <w:b/>
     </w:rPr>
   </w:style>
   <w:style w:customStyle="1" w:styleId="Definition" w:type="paragraph">
     <w:name w:val="Definition"/>
     <w:basedOn w:val="Normal"/>
+    <w:rPr>
+      <w:rFonts w:ascii="WenQuanYi Zen Hei" w:hAnsi="WenQuanYi Zen Hei" w:eastAsia="WenQuanYi Zen Hei" w:cs="WenQuanYi Zen Hei"/>
+    </w:rPr>
   </w:style>
   <w:style w:styleId="Caption" w:type="paragraph">
     <w:name w:val="Caption"/>
@@ -2239,6 +2622,7 @@
       <w:spacing w:after="120" w:before="0"/>
     </w:pPr>
     <w:rPr>
+      <w:rFonts w:ascii="WenQuanYi Zen Hei" w:hAnsi="WenQuanYi Zen Hei" w:eastAsia="WenQuanYi Zen Hei" w:cs="WenQuanYi Zen Hei"/>
       <w:i/>
     </w:rPr>
   </w:style>
@@ -2248,14 +2632,23 @@
     <w:pPr>
       <w:keepNext/>
     </w:pPr>
+    <w:rPr>
+      <w:rFonts w:ascii="WenQuanYi Zen Hei" w:hAnsi="WenQuanYi Zen Hei" w:eastAsia="WenQuanYi Zen Hei" w:cs="WenQuanYi Zen Hei"/>
+    </w:rPr>
   </w:style>
   <w:style w:customStyle="1" w:styleId="ImageCaption" w:type="paragraph">
     <w:name w:val="Image Caption"/>
     <w:basedOn w:val="Caption"/>
+    <w:rPr>
+      <w:rFonts w:ascii="WenQuanYi Zen Hei" w:hAnsi="WenQuanYi Zen Hei" w:eastAsia="WenQuanYi Zen Hei" w:cs="WenQuanYi Zen Hei"/>
+    </w:rPr>
   </w:style>
   <w:style w:customStyle="1" w:styleId="Figure" w:type="paragraph">
     <w:name w:val="Figure"/>
     <w:basedOn w:val="Normal"/>
+    <w:rPr>
+      <w:rFonts w:ascii="WenQuanYi Zen Hei" w:hAnsi="WenQuanYi Zen Hei" w:eastAsia="WenQuanYi Zen Hei" w:cs="WenQuanYi Zen Hei"/>
+    </w:rPr>
   </w:style>
   <w:style w:customStyle="1" w:styleId="CaptionedFigure" w:type="paragraph">
     <w:name w:val="Captioned Figure"/>
@@ -2263,28 +2656,38 @@
     <w:pPr>
       <w:keepNext/>
     </w:pPr>
+    <w:rPr>
+      <w:rFonts w:ascii="WenQuanYi Zen Hei" w:hAnsi="WenQuanYi Zen Hei" w:eastAsia="WenQuanYi Zen Hei" w:cs="WenQuanYi Zen Hei"/>
+    </w:rPr>
   </w:style>
   <w:style w:customStyle="1" w:styleId="BodyTextChar" w:type="character">
     <w:name w:val="Body Text Char"/>
     <w:basedOn w:val="DefaultParagraphFont"/>
     <w:link w:val="BodyText"/>
+    <w:rPr>
+      <w:rFonts w:ascii="WenQuanYi Zen Hei" w:hAnsi="WenQuanYi Zen Hei" w:eastAsia="WenQuanYi Zen Hei" w:cs="WenQuanYi Zen Hei"/>
+    </w:rPr>
   </w:style>
   <w:style w:customStyle="1" w:styleId="VerbatimChar" w:type="character">
     <w:name w:val="Verbatim Char"/>
     <w:basedOn w:val="BodyTextChar"/>
     <w:rPr>
-      <w:rFonts w:ascii="Consolas" w:hAnsi="Consolas"/>
+      <w:rFonts w:ascii="WenQuanYi Zen Hei" w:hAnsi="WenQuanYi Zen Hei" w:eastAsia="WenQuanYi Zen Hei" w:cs="WenQuanYi Zen Hei"/>
       <w:sz w:val="22"/>
     </w:rPr>
   </w:style>
   <w:style w:customStyle="1" w:styleId="SectionNumber" w:type="character">
     <w:name w:val="Section Number"/>
     <w:basedOn w:val="BodyTextChar"/>
+    <w:rPr>
+      <w:rFonts w:ascii="WenQuanYi Zen Hei" w:hAnsi="WenQuanYi Zen Hei" w:eastAsia="WenQuanYi Zen Hei" w:cs="WenQuanYi Zen Hei"/>
+    </w:rPr>
   </w:style>
   <w:style w:styleId="FootnoteReference" w:type="character">
     <w:name w:val="Footnote Reference"/>
     <w:basedOn w:val="BodyTextChar"/>
     <w:rPr>
+      <w:rFonts w:ascii="WenQuanYi Zen Hei" w:hAnsi="WenQuanYi Zen Hei" w:eastAsia="WenQuanYi Zen Hei" w:cs="WenQuanYi Zen Hei"/>
       <w:vertAlign w:val="superscript"/>
     </w:rPr>
   </w:style>
@@ -2292,6 +2695,7 @@
     <w:name w:val="Hyperlink"/>
     <w:basedOn w:val="BodyTextChar"/>
     <w:rPr>
+      <w:rFonts w:ascii="WenQuanYi Zen Hei" w:hAnsi="WenQuanYi Zen Hei" w:eastAsia="WenQuanYi Zen Hei" w:cs="WenQuanYi Zen Hei"/>
       <w:color w:themeColor="accent1" w:val="4F81BD"/>
     </w:rPr>
   </w:style>
@@ -2307,7 +2711,7 @@
       <w:outlineLvl w:val="9"/>
     </w:pPr>
     <w:rPr>
-      <w:rFonts w:asciiTheme="majorHAnsi" w:cstheme="majorBidi" w:eastAsiaTheme="majorEastAsia" w:hAnsiTheme="majorHAnsi"/>
+      <w:rFonts w:asciiTheme="majorHAnsi" w:cstheme="majorBidi" w:eastAsiaTheme="majorEastAsia" w:hAnsiTheme="majorHAnsi" w:ascii="WenQuanYi Zen Hei" w:hAnsi="WenQuanYi Zen Hei" w:eastAsia="WenQuanYi Zen Hei" w:cs="WenQuanYi Zen Hei"/>
       <w:b w:val="0"/>
       <w:bCs w:val="0"/>
       <w:color w:themeColor="accent1" w:themeShade="BF" w:val="365F91"/>
@@ -2320,12 +2724,16 @@
     <w:pPr>
       <w:wordWrap w:val="off"/>
     </w:pPr>
+    <w:rPr>
+      <w:rFonts w:ascii="WenQuanYi Zen Hei" w:hAnsi="WenQuanYi Zen Hei" w:eastAsia="WenQuanYi Zen Hei" w:cs="WenQuanYi Zen Hei"/>
+    </w:rPr>
   </w:style>
   <w:style w:type="character" w:customStyle="1" w:styleId="KeywordTok">
     <w:name w:val="KeywordTok"/>
     <w:basedOn w:val="VerbatimChar"/>
     <w:rPr>
       <w:color w:val="007020"/>
+      <w:rFonts w:ascii="WenQuanYi Zen Hei" w:hAnsi="WenQuanYi Zen Hei" w:eastAsia="WenQuanYi Zen Hei" w:cs="WenQuanYi Zen Hei"/>
       <w:b/>
     </w:rPr>
   </w:style>
@@ -2333,6 +2741,7 @@
     <w:name w:val="DataTypeTok"/>
     <w:basedOn w:val="VerbatimChar"/>
     <w:rPr>
+      <w:rFonts w:ascii="WenQuanYi Zen Hei" w:hAnsi="WenQuanYi Zen Hei" w:eastAsia="WenQuanYi Zen Hei" w:cs="WenQuanYi Zen Hei"/>
       <w:color w:val="902000"/>
     </w:rPr>
   </w:style>
@@ -2340,6 +2749,7 @@
     <w:name w:val="DecValTok"/>
     <w:basedOn w:val="VerbatimChar"/>
     <w:rPr>
+      <w:rFonts w:ascii="WenQuanYi Zen Hei" w:hAnsi="WenQuanYi Zen Hei" w:eastAsia="WenQuanYi Zen Hei" w:cs="WenQuanYi Zen Hei"/>
       <w:color w:val="40a070"/>
     </w:rPr>
   </w:style>
@@ -2347,6 +2757,7 @@
     <w:name w:val="BaseNTok"/>
     <w:basedOn w:val="VerbatimChar"/>
     <w:rPr>
+      <w:rFonts w:ascii="WenQuanYi Zen Hei" w:hAnsi="WenQuanYi Zen Hei" w:eastAsia="WenQuanYi Zen Hei" w:cs="WenQuanYi Zen Hei"/>
       <w:color w:val="40a070"/>
     </w:rPr>
   </w:style>
@@ -2354,6 +2765,7 @@
     <w:name w:val="FloatTok"/>
     <w:basedOn w:val="VerbatimChar"/>
     <w:rPr>
+      <w:rFonts w:ascii="WenQuanYi Zen Hei" w:hAnsi="WenQuanYi Zen Hei" w:eastAsia="WenQuanYi Zen Hei" w:cs="WenQuanYi Zen Hei"/>
       <w:color w:val="40a070"/>
     </w:rPr>
   </w:style>
@@ -2361,6 +2773,7 @@
     <w:name w:val="ConstantTok"/>
     <w:basedOn w:val="VerbatimChar"/>
     <w:rPr>
+      <w:rFonts w:ascii="WenQuanYi Zen Hei" w:hAnsi="WenQuanYi Zen Hei" w:eastAsia="WenQuanYi Zen Hei" w:cs="WenQuanYi Zen Hei"/>
       <w:color w:val="880000"/>
     </w:rPr>
   </w:style>
@@ -2368,6 +2781,7 @@
     <w:name w:val="CharTok"/>
     <w:basedOn w:val="VerbatimChar"/>
     <w:rPr>
+      <w:rFonts w:ascii="WenQuanYi Zen Hei" w:hAnsi="WenQuanYi Zen Hei" w:eastAsia="WenQuanYi Zen Hei" w:cs="WenQuanYi Zen Hei"/>
       <w:color w:val="4070a0"/>
     </w:rPr>
   </w:style>
@@ -2375,6 +2789,7 @@
     <w:name w:val="SpecialCharTok"/>
     <w:basedOn w:val="VerbatimChar"/>
     <w:rPr>
+      <w:rFonts w:ascii="WenQuanYi Zen Hei" w:hAnsi="WenQuanYi Zen Hei" w:eastAsia="WenQuanYi Zen Hei" w:cs="WenQuanYi Zen Hei"/>
       <w:color w:val="4070a0"/>
     </w:rPr>
   </w:style>
@@ -2382,6 +2797,7 @@
     <w:name w:val="StringTok"/>
     <w:basedOn w:val="VerbatimChar"/>
     <w:rPr>
+      <w:rFonts w:ascii="WenQuanYi Zen Hei" w:hAnsi="WenQuanYi Zen Hei" w:eastAsia="WenQuanYi Zen Hei" w:cs="WenQuanYi Zen Hei"/>
       <w:color w:val="4070a0"/>
     </w:rPr>
   </w:style>
@@ -2389,6 +2805,7 @@
     <w:name w:val="VerbatimStringTok"/>
     <w:basedOn w:val="VerbatimChar"/>
     <w:rPr>
+      <w:rFonts w:ascii="WenQuanYi Zen Hei" w:hAnsi="WenQuanYi Zen Hei" w:eastAsia="WenQuanYi Zen Hei" w:cs="WenQuanYi Zen Hei"/>
       <w:color w:val="4070a0"/>
     </w:rPr>
   </w:style>
@@ -2396,6 +2813,7 @@
     <w:name w:val="SpecialStringTok"/>
     <w:basedOn w:val="VerbatimChar"/>
     <w:rPr>
+      <w:rFonts w:ascii="WenQuanYi Zen Hei" w:hAnsi="WenQuanYi Zen Hei" w:eastAsia="WenQuanYi Zen Hei" w:cs="WenQuanYi Zen Hei"/>
       <w:color w:val="bb6688"/>
     </w:rPr>
   </w:style>
@@ -2404,6 +2822,7 @@
     <w:basedOn w:val="VerbatimChar"/>
     <w:rPr>
       <w:color w:val="008000"/>
+      <w:rFonts w:ascii="WenQuanYi Zen Hei" w:hAnsi="WenQuanYi Zen Hei" w:eastAsia="WenQuanYi Zen Hei" w:cs="WenQuanYi Zen Hei"/>
       <w:b/>
     </w:rPr>
   </w:style>
@@ -2412,6 +2831,7 @@
     <w:basedOn w:val="VerbatimChar"/>
     <w:rPr>
       <w:color w:val="60a0b0"/>
+      <w:rFonts w:ascii="WenQuanYi Zen Hei" w:hAnsi="WenQuanYi Zen Hei" w:eastAsia="WenQuanYi Zen Hei" w:cs="WenQuanYi Zen Hei"/>
       <w:i/>
     </w:rPr>
   </w:style>
@@ -2420,6 +2840,7 @@
     <w:basedOn w:val="VerbatimChar"/>
     <w:rPr>
       <w:color w:val="ba2121"/>
+      <w:rFonts w:ascii="WenQuanYi Zen Hei" w:hAnsi="WenQuanYi Zen Hei" w:eastAsia="WenQuanYi Zen Hei" w:cs="WenQuanYi Zen Hei"/>
       <w:i/>
     </w:rPr>
   </w:style>
@@ -2428,6 +2849,7 @@
     <w:basedOn w:val="VerbatimChar"/>
     <w:rPr>
       <w:color w:val="60a0b0"/>
+      <w:rFonts w:ascii="WenQuanYi Zen Hei" w:hAnsi="WenQuanYi Zen Hei" w:eastAsia="WenQuanYi Zen Hei" w:cs="WenQuanYi Zen Hei"/>
       <w:b/>
       <w:i/>
     </w:rPr>
@@ -2437,6 +2859,7 @@
     <w:basedOn w:val="VerbatimChar"/>
     <w:rPr>
       <w:color w:val="60a0b0"/>
+      <w:rFonts w:ascii="WenQuanYi Zen Hei" w:hAnsi="WenQuanYi Zen Hei" w:eastAsia="WenQuanYi Zen Hei" w:cs="WenQuanYi Zen Hei"/>
       <w:b/>
       <w:i/>
     </w:rPr>
@@ -2445,6 +2868,7 @@
     <w:name w:val="OtherTok"/>
     <w:basedOn w:val="VerbatimChar"/>
     <w:rPr>
+      <w:rFonts w:ascii="WenQuanYi Zen Hei" w:hAnsi="WenQuanYi Zen Hei" w:eastAsia="WenQuanYi Zen Hei" w:cs="WenQuanYi Zen Hei"/>
       <w:color w:val="007020"/>
     </w:rPr>
   </w:style>
@@ -2452,6 +2876,7 @@
     <w:name w:val="FunctionTok"/>
     <w:basedOn w:val="VerbatimChar"/>
     <w:rPr>
+      <w:rFonts w:ascii="WenQuanYi Zen Hei" w:hAnsi="WenQuanYi Zen Hei" w:eastAsia="WenQuanYi Zen Hei" w:cs="WenQuanYi Zen Hei"/>
       <w:color w:val="06287e"/>
     </w:rPr>
   </w:style>
@@ -2459,6 +2884,7 @@
     <w:name w:val="VariableTok"/>
     <w:basedOn w:val="VerbatimChar"/>
     <w:rPr>
+      <w:rFonts w:ascii="WenQuanYi Zen Hei" w:hAnsi="WenQuanYi Zen Hei" w:eastAsia="WenQuanYi Zen Hei" w:cs="WenQuanYi Zen Hei"/>
       <w:color w:val="19177c"/>
     </w:rPr>
   </w:style>
@@ -2467,6 +2893,7 @@
     <w:basedOn w:val="VerbatimChar"/>
     <w:rPr>
       <w:color w:val="007020"/>
+      <w:rFonts w:ascii="WenQuanYi Zen Hei" w:hAnsi="WenQuanYi Zen Hei" w:eastAsia="WenQuanYi Zen Hei" w:cs="WenQuanYi Zen Hei"/>
       <w:b/>
     </w:rPr>
   </w:style>
@@ -2474,6 +2901,7 @@
     <w:name w:val="OperatorTok"/>
     <w:basedOn w:val="VerbatimChar"/>
     <w:rPr>
+      <w:rFonts w:ascii="WenQuanYi Zen Hei" w:hAnsi="WenQuanYi Zen Hei" w:eastAsia="WenQuanYi Zen Hei" w:cs="WenQuanYi Zen Hei"/>
       <w:color w:val="666666"/>
     </w:rPr>
   </w:style>
@@ -2481,18 +2909,22 @@
     <w:name w:val="BuiltInTok"/>
     <w:basedOn w:val="VerbatimChar"/>
     <w:rPr>
+      <w:rFonts w:ascii="WenQuanYi Zen Hei" w:hAnsi="WenQuanYi Zen Hei" w:eastAsia="WenQuanYi Zen Hei" w:cs="WenQuanYi Zen Hei"/>
       <w:color w:val="008000"/>
     </w:rPr>
   </w:style>
   <w:style w:type="character" w:customStyle="1" w:styleId="ExtensionTok">
     <w:name w:val="ExtensionTok"/>
     <w:basedOn w:val="VerbatimChar"/>
-    <w:rPr/>
+    <w:rPr>
+      <w:rFonts w:ascii="WenQuanYi Zen Hei" w:hAnsi="WenQuanYi Zen Hei" w:eastAsia="WenQuanYi Zen Hei" w:cs="WenQuanYi Zen Hei"/>
+    </w:rPr>
   </w:style>
   <w:style w:type="character" w:customStyle="1" w:styleId="PreprocessorTok">
     <w:name w:val="PreprocessorTok"/>
     <w:basedOn w:val="VerbatimChar"/>
     <w:rPr>
+      <w:rFonts w:ascii="WenQuanYi Zen Hei" w:hAnsi="WenQuanYi Zen Hei" w:eastAsia="WenQuanYi Zen Hei" w:cs="WenQuanYi Zen Hei"/>
       <w:color w:val="bc7a00"/>
     </w:rPr>
   </w:style>
@@ -2500,19 +2932,23 @@
     <w:name w:val="AttributeTok"/>
     <w:basedOn w:val="VerbatimChar"/>
     <w:rPr>
+      <w:rFonts w:ascii="WenQuanYi Zen Hei" w:hAnsi="WenQuanYi Zen Hei" w:eastAsia="WenQuanYi Zen Hei" w:cs="WenQuanYi Zen Hei"/>
       <w:color w:val="7d9029"/>
     </w:rPr>
   </w:style>
   <w:style w:type="character" w:customStyle="1" w:styleId="RegionMarkerTok">
     <w:name w:val="RegionMarkerTok"/>
     <w:basedOn w:val="VerbatimChar"/>
-    <w:rPr/>
+    <w:rPr>
+      <w:rFonts w:ascii="WenQuanYi Zen Hei" w:hAnsi="WenQuanYi Zen Hei" w:eastAsia="WenQuanYi Zen Hei" w:cs="WenQuanYi Zen Hei"/>
+    </w:rPr>
   </w:style>
   <w:style w:type="character" w:customStyle="1" w:styleId="InformationTok">
     <w:name w:val="InformationTok"/>
     <w:basedOn w:val="VerbatimChar"/>
     <w:rPr>
       <w:color w:val="60a0b0"/>
+      <w:rFonts w:ascii="WenQuanYi Zen Hei" w:hAnsi="WenQuanYi Zen Hei" w:eastAsia="WenQuanYi Zen Hei" w:cs="WenQuanYi Zen Hei"/>
       <w:b/>
       <w:i/>
     </w:rPr>
@@ -2522,6 +2958,7 @@
     <w:basedOn w:val="VerbatimChar"/>
     <w:rPr>
       <w:color w:val="60a0b0"/>
+      <w:rFonts w:ascii="WenQuanYi Zen Hei" w:hAnsi="WenQuanYi Zen Hei" w:eastAsia="WenQuanYi Zen Hei" w:cs="WenQuanYi Zen Hei"/>
       <w:b/>
       <w:i/>
     </w:rPr>
@@ -2531,6 +2968,7 @@
     <w:basedOn w:val="VerbatimChar"/>
     <w:rPr>
       <w:color w:val="ff0000"/>
+      <w:rFonts w:ascii="WenQuanYi Zen Hei" w:hAnsi="WenQuanYi Zen Hei" w:eastAsia="WenQuanYi Zen Hei" w:cs="WenQuanYi Zen Hei"/>
       <w:b/>
     </w:rPr>
   </w:style>
@@ -2539,13 +2977,16 @@
     <w:basedOn w:val="VerbatimChar"/>
     <w:rPr>
       <w:color w:val="ff0000"/>
+      <w:rFonts w:ascii="WenQuanYi Zen Hei" w:hAnsi="WenQuanYi Zen Hei" w:eastAsia="WenQuanYi Zen Hei" w:cs="WenQuanYi Zen Hei"/>
       <w:b/>
     </w:rPr>
   </w:style>
   <w:style w:type="character" w:customStyle="1" w:styleId="NormalTok">
     <w:name w:val="NormalTok"/>
     <w:basedOn w:val="VerbatimChar"/>
-    <w:rPr/>
+    <w:rPr>
+      <w:rFonts w:ascii="WenQuanYi Zen Hei" w:hAnsi="WenQuanYi Zen Hei" w:eastAsia="WenQuanYi Zen Hei" w:cs="WenQuanYi Zen Hei"/>
+    </w:rPr>
   </w:style>
 </w:styles>
 </file>

</xml_diff>